<commit_message>
Implement confirmed Curaleaf integration rules
</commit_message>
<xml_diff>
--- a/specs/Curaleaf-OpenItems-Email-and-Agenda.docx
+++ b/specs/Curaleaf-OpenItems-Email-and-Agenda.docx
@@ -818,10 +818,1104 @@
       <w:r>
         <w:rPr>
           <w:rFonts w:ascii="Arial" w:cs="Arial" w:eastAsia="Arial" w:hAnsi="Arial"/>
-          <w:sz w:val="22"/>
+          <w:sz w:val="18"/>
           <w:szCs w:val="22"/>
         </w:rPr>
         <w:t xml:space="preserve">Endpoint build timeline for GET /products and POST /prescription.</w:t>
+      </w:r>
+    </w:p>
+    <w:p>
+      <w:r>
+        <w:rPr>
+          <w:sz w:val="18"/>
+        </w:rPr>
+        <w:br w:type="page"/>
+      </w:r>
+    </w:p>
+    <w:p>
+      <w:pPr>
+        <w:spacing w:after="160"/>
+      </w:pPr>
+      <w:r>
+        <w:rPr>
+          <w:b/>
+          <w:sz w:val="18"/>
+        </w:rPr>
+        <w:t>Response status — 5 August 2026</w:t>
+      </w:r>
+    </w:p>
+    <w:p>
+      <w:r>
+        <w:rPr>
+          <w:sz w:val="18"/>
+        </w:rPr>
+        <w:t>Phil responded to the thirteen integration questions. The table below records what is confirmed, implemented, conditional, or still awaiting Curaleaf, Ellis, or legal/commercial colleagues.</w:t>
+      </w:r>
+    </w:p>
+    <w:tbl>
+      <w:tblPr>
+        <w:tblW w:type="auto" w:w="0"/>
+        <w:tblLayout w:type="fixed"/>
+        <w:tblLook w:firstColumn="1" w:firstRow="1" w:lastColumn="0" w:lastRow="0" w:noHBand="0" w:noVBand="1" w:val="04A0"/>
+        <w:tblBorders>
+          <w:top w:val="single" w:sz="4" w:color="B7C9D3"/>
+          <w:left w:val="single" w:sz="4" w:color="B7C9D3"/>
+          <w:bottom w:val="single" w:sz="4" w:color="B7C9D3"/>
+          <w:right w:val="single" w:sz="4" w:color="B7C9D3"/>
+          <w:insideH w:val="single" w:sz="4" w:color="B7C9D3"/>
+          <w:insideV w:val="single" w:sz="4" w:color="B7C9D3"/>
+        </w:tblBorders>
+      </w:tblPr>
+      <w:tblGrid>
+        <w:gridCol w:w="2340"/>
+        <w:gridCol w:w="2340"/>
+        <w:gridCol w:w="2340"/>
+        <w:gridCol w:w="2340"/>
+      </w:tblGrid>
+      <w:tr>
+        <w:tc>
+          <w:tcPr>
+            <w:tcW w:type="dxa" w:w="792"/>
+            <w:shd w:fill="DCEAF0"/>
+            <w:vAlign w:val="center"/>
+          </w:tcPr>
+          <w:p>
+            <w:pPr>
+              <w:spacing w:after="20" w:before="20"/>
+            </w:pPr>
+            <w:r>
+              <w:rPr>
+                <w:b/>
+                <w:sz w:val="14"/>
+              </w:rPr>
+              <w:t>Item</w:t>
+            </w:r>
+          </w:p>
+        </w:tc>
+        <w:tc>
+          <w:tcPr>
+            <w:tcW w:type="dxa" w:w="3384"/>
+            <w:shd w:fill="DCEAF0"/>
+            <w:vAlign w:val="center"/>
+          </w:tcPr>
+          <w:p>
+            <w:pPr>
+              <w:spacing w:after="20" w:before="20"/>
+            </w:pPr>
+            <w:r>
+              <w:rPr>
+                <w:b/>
+                <w:sz w:val="14"/>
+              </w:rPr>
+              <w:t>Curaleaf response</w:t>
+            </w:r>
+          </w:p>
+        </w:tc>
+        <w:tc>
+          <w:tcPr>
+            <w:tcW w:type="dxa" w:w="4392"/>
+            <w:shd w:fill="DCEAF0"/>
+            <w:vAlign w:val="center"/>
+          </w:tcPr>
+          <w:p>
+            <w:pPr>
+              <w:spacing w:after="20" w:before="20"/>
+            </w:pPr>
+            <w:r>
+              <w:rPr>
+                <w:b/>
+                <w:sz w:val="14"/>
+              </w:rPr>
+              <w:t>HHH requirement / action</w:t>
+            </w:r>
+          </w:p>
+        </w:tc>
+        <w:tc>
+          <w:tcPr>
+            <w:tcW w:type="dxa" w:w="1224"/>
+            <w:shd w:fill="DCEAF0"/>
+            <w:vAlign w:val="center"/>
+          </w:tcPr>
+          <w:p>
+            <w:pPr>
+              <w:spacing w:after="20" w:before="20"/>
+            </w:pPr>
+            <w:r>
+              <w:rPr>
+                <w:b/>
+                <w:sz w:val="14"/>
+              </w:rPr>
+              <w:t>Position</w:t>
+            </w:r>
+          </w:p>
+        </w:tc>
+      </w:tr>
+      <w:tr>
+        <w:tc>
+          <w:tcPr>
+            <w:tcW w:type="dxa" w:w="792"/>
+            <w:vAlign w:val="center"/>
+          </w:tcPr>
+          <w:p>
+            <w:pPr>
+              <w:spacing w:after="20" w:before="20"/>
+            </w:pPr>
+            <w:r>
+              <w:rPr>
+                <w:sz w:val="14"/>
+              </w:rPr>
+              <w:t>Q1</w:t>
+            </w:r>
+          </w:p>
+        </w:tc>
+        <w:tc>
+          <w:tcPr>
+            <w:tcW w:type="dxa" w:w="3384"/>
+            <w:vAlign w:val="center"/>
+          </w:tcPr>
+          <w:p>
+            <w:pPr>
+              <w:spacing w:after="20" w:before="20"/>
+            </w:pPr>
+            <w:r>
+              <w:rPr>
+                <w:sz w:val="14"/>
+              </w:rPr>
+              <w:t>customerId is Curaleaf’s stable internal pharmacy identifier.</w:t>
+            </w:r>
+          </w:p>
+        </w:tc>
+        <w:tc>
+          <w:tcPr>
+            <w:tcW w:type="dxa" w:w="4392"/>
+            <w:vAlign w:val="center"/>
+          </w:tcPr>
+          <w:p>
+            <w:pPr>
+              <w:spacing w:after="20" w:before="20"/>
+            </w:pPr>
+            <w:r>
+              <w:rPr>
+                <w:sz w:val="14"/>
+              </w:rPr>
+              <w:t>Store it as an internal/PHAR identifier; never infer a GPhC mapping.</w:t>
+            </w:r>
+          </w:p>
+        </w:tc>
+        <w:tc>
+          <w:tcPr>
+            <w:tcW w:type="dxa" w:w="1224"/>
+            <w:vAlign w:val="center"/>
+          </w:tcPr>
+          <w:p>
+            <w:pPr>
+              <w:spacing w:after="20" w:before="20"/>
+            </w:pPr>
+            <w:r>
+              <w:rPr>
+                <w:sz w:val="14"/>
+              </w:rPr>
+              <w:t>Confirmed</w:t>
+            </w:r>
+          </w:p>
+        </w:tc>
+      </w:tr>
+      <w:tr>
+        <w:tc>
+          <w:tcPr>
+            <w:tcW w:type="dxa" w:w="792"/>
+            <w:vAlign w:val="center"/>
+          </w:tcPr>
+          <w:p>
+            <w:pPr>
+              <w:spacing w:after="20" w:before="20"/>
+            </w:pPr>
+            <w:r>
+              <w:rPr>
+                <w:sz w:val="14"/>
+              </w:rPr>
+              <w:t>Q2</w:t>
+            </w:r>
+          </w:p>
+        </w:tc>
+        <w:tc>
+          <w:tcPr>
+            <w:tcW w:type="dxa" w:w="3384"/>
+            <w:vAlign w:val="center"/>
+          </w:tcPr>
+          <w:p>
+            <w:pPr>
+              <w:spacing w:after="20" w:before="20"/>
+            </w:pPr>
+            <w:r>
+              <w:rPr>
+                <w:sz w:val="14"/>
+              </w:rPr>
+              <w:t>Customer-specific catalogues and prices are possible; applicability to HHH awaits Ellis.</w:t>
+            </w:r>
+          </w:p>
+        </w:tc>
+        <w:tc>
+          <w:tcPr>
+            <w:tcW w:type="dxa" w:w="4392"/>
+            <w:vAlign w:val="center"/>
+          </w:tcPr>
+          <w:p>
+            <w:pPr>
+              <w:spacing w:after="20" w:before="20"/>
+            </w:pPr>
+            <w:r>
+              <w:rPr>
+                <w:sz w:val="14"/>
+              </w:rPr>
+              <w:t>Keep catalogue and quote data isolated per pharmacy key and cache.</w:t>
+            </w:r>
+          </w:p>
+        </w:tc>
+        <w:tc>
+          <w:tcPr>
+            <w:tcW w:type="dxa" w:w="1224"/>
+            <w:vAlign w:val="center"/>
+          </w:tcPr>
+          <w:p>
+            <w:pPr>
+              <w:spacing w:after="20" w:before="20"/>
+            </w:pPr>
+            <w:r>
+              <w:rPr>
+                <w:sz w:val="14"/>
+              </w:rPr>
+              <w:t>Open with Ellis</w:t>
+            </w:r>
+          </w:p>
+        </w:tc>
+      </w:tr>
+      <w:tr>
+        <w:tc>
+          <w:tcPr>
+            <w:tcW w:type="dxa" w:w="792"/>
+            <w:vAlign w:val="center"/>
+          </w:tcPr>
+          <w:p>
+            <w:pPr>
+              <w:spacing w:after="20" w:before="20"/>
+            </w:pPr>
+            <w:r>
+              <w:rPr>
+                <w:sz w:val="14"/>
+              </w:rPr>
+              <w:t>Q3</w:t>
+            </w:r>
+          </w:p>
+        </w:tc>
+        <w:tc>
+          <w:tcPr>
+            <w:tcW w:type="dxa" w:w="3384"/>
+            <w:vAlign w:val="center"/>
+          </w:tcPr>
+          <w:p>
+            <w:pPr>
+              <w:spacing w:after="20" w:before="20"/>
+            </w:pPr>
+            <w:r>
+              <w:rPr>
+                <w:sz w:val="14"/>
+              </w:rPr>
+              <w:t>No master/partner API key is available.</w:t>
+            </w:r>
+          </w:p>
+        </w:tc>
+        <w:tc>
+          <w:tcPr>
+            <w:tcW w:type="dxa" w:w="4392"/>
+            <w:vAlign w:val="center"/>
+          </w:tcPr>
+          <w:p>
+            <w:pPr>
+              <w:spacing w:after="20" w:before="20"/>
+            </w:pPr>
+            <w:r>
+              <w:rPr>
+                <w:sz w:val="14"/>
+              </w:rPr>
+              <w:t>Use a separate read/write key per pharmacy; optional separate read-only key.</w:t>
+            </w:r>
+          </w:p>
+        </w:tc>
+        <w:tc>
+          <w:tcPr>
+            <w:tcW w:type="dxa" w:w="1224"/>
+            <w:vAlign w:val="center"/>
+          </w:tcPr>
+          <w:p>
+            <w:pPr>
+              <w:spacing w:after="20" w:before="20"/>
+            </w:pPr>
+            <w:r>
+              <w:rPr>
+                <w:sz w:val="14"/>
+              </w:rPr>
+              <w:t>Confirmed</w:t>
+            </w:r>
+          </w:p>
+        </w:tc>
+      </w:tr>
+      <w:tr>
+        <w:tc>
+          <w:tcPr>
+            <w:tcW w:type="dxa" w:w="792"/>
+            <w:vAlign w:val="center"/>
+          </w:tcPr>
+          <w:p>
+            <w:pPr>
+              <w:spacing w:after="20" w:before="20"/>
+            </w:pPr>
+            <w:r>
+              <w:rPr>
+                <w:sz w:val="14"/>
+              </w:rPr>
+              <w:t>Q4</w:t>
+            </w:r>
+          </w:p>
+        </w:tc>
+        <w:tc>
+          <w:tcPr>
+            <w:tcW w:type="dxa" w:w="3384"/>
+            <w:vAlign w:val="center"/>
+          </w:tcPr>
+          <w:p>
+            <w:pPr>
+              <w:spacing w:after="20" w:before="20"/>
+            </w:pPr>
+            <w:r>
+              <w:rPr>
+                <w:sz w:val="14"/>
+              </w:rPr>
+              <w:t>Stocked development products are still to be supplied.</w:t>
+            </w:r>
+          </w:p>
+        </w:tc>
+        <w:tc>
+          <w:tcPr>
+            <w:tcW w:type="dxa" w:w="4392"/>
+            <w:vAlign w:val="center"/>
+          </w:tcPr>
+          <w:p>
+            <w:pPr>
+              <w:spacing w:after="20" w:before="20"/>
+            </w:pPr>
+            <w:r>
+              <w:rPr>
+                <w:sz w:val="14"/>
+              </w:rPr>
+              <w:t>Keep stocked quote/PO/shipment sandbox testing blocked.</w:t>
+            </w:r>
+          </w:p>
+        </w:tc>
+        <w:tc>
+          <w:tcPr>
+            <w:tcW w:type="dxa" w:w="1224"/>
+            <w:vAlign w:val="center"/>
+          </w:tcPr>
+          <w:p>
+            <w:pPr>
+              <w:spacing w:after="20" w:before="20"/>
+            </w:pPr>
+            <w:r>
+              <w:rPr>
+                <w:sz w:val="14"/>
+              </w:rPr>
+              <w:t>Curaleaf action</w:t>
+            </w:r>
+          </w:p>
+        </w:tc>
+      </w:tr>
+      <w:tr>
+        <w:tc>
+          <w:tcPr>
+            <w:tcW w:type="dxa" w:w="792"/>
+            <w:vAlign w:val="center"/>
+          </w:tcPr>
+          <w:p>
+            <w:pPr>
+              <w:spacing w:after="20" w:before="20"/>
+            </w:pPr>
+            <w:r>
+              <w:rPr>
+                <w:sz w:val="14"/>
+              </w:rPr>
+              <w:t>Q5</w:t>
+            </w:r>
+          </w:p>
+        </w:tc>
+        <w:tc>
+          <w:tcPr>
+            <w:tcW w:type="dxa" w:w="3384"/>
+            <w:vAlign w:val="center"/>
+          </w:tcPr>
+          <w:p>
+            <w:pPr>
+              <w:spacing w:after="20" w:before="20"/>
+            </w:pPr>
+            <w:r>
+              <w:rPr>
+                <w:sz w:val="14"/>
+              </w:rPr>
+              <w:t>Existing and second dev-pharmacy keys are still to be supplied.</w:t>
+            </w:r>
+          </w:p>
+        </w:tc>
+        <w:tc>
+          <w:tcPr>
+            <w:tcW w:type="dxa" w:w="4392"/>
+            <w:vAlign w:val="center"/>
+          </w:tcPr>
+          <w:p>
+            <w:pPr>
+              <w:spacing w:after="20" w:before="20"/>
+            </w:pPr>
+            <w:r>
+              <w:rPr>
+                <w:sz w:val="14"/>
+              </w:rPr>
+              <w:t>Complete two-tenant isolation UAT when both keys arrive.</w:t>
+            </w:r>
+          </w:p>
+        </w:tc>
+        <w:tc>
+          <w:tcPr>
+            <w:tcW w:type="dxa" w:w="1224"/>
+            <w:vAlign w:val="center"/>
+          </w:tcPr>
+          <w:p>
+            <w:pPr>
+              <w:spacing w:after="20" w:before="20"/>
+            </w:pPr>
+            <w:r>
+              <w:rPr>
+                <w:sz w:val="14"/>
+              </w:rPr>
+              <w:t>Curaleaf action</w:t>
+            </w:r>
+          </w:p>
+        </w:tc>
+      </w:tr>
+      <w:tr>
+        <w:tc>
+          <w:tcPr>
+            <w:tcW w:type="dxa" w:w="792"/>
+            <w:vAlign w:val="center"/>
+          </w:tcPr>
+          <w:p>
+            <w:pPr>
+              <w:spacing w:after="20" w:before="20"/>
+            </w:pPr>
+            <w:r>
+              <w:rPr>
+                <w:sz w:val="14"/>
+              </w:rPr>
+              <w:t>Q6</w:t>
+            </w:r>
+          </w:p>
+        </w:tc>
+        <w:tc>
+          <w:tcPr>
+            <w:tcW w:type="dxa" w:w="3384"/>
+            <w:vAlign w:val="center"/>
+          </w:tcPr>
+          <w:p>
+            <w:pPr>
+              <w:spacing w:after="20" w:before="20"/>
+            </w:pPr>
+            <w:r>
+              <w:rPr>
+                <w:sz w:val="14"/>
+              </w:rPr>
+              <w:t>After joint integration acceptance and Ellis approval, later pharmacies may go directly live.</w:t>
+            </w:r>
+          </w:p>
+        </w:tc>
+        <w:tc>
+          <w:tcPr>
+            <w:tcW w:type="dxa" w:w="4392"/>
+            <w:vAlign w:val="center"/>
+          </w:tcPr>
+          <w:p>
+            <w:pPr>
+              <w:spacing w:after="20" w:before="20"/>
+            </w:pPr>
+            <w:r>
+              <w:rPr>
+                <w:sz w:val="14"/>
+              </w:rPr>
+              <w:t>Document a conditional onboarding route; do not enable it before written approval.</w:t>
+            </w:r>
+          </w:p>
+        </w:tc>
+        <w:tc>
+          <w:tcPr>
+            <w:tcW w:type="dxa" w:w="1224"/>
+            <w:vAlign w:val="center"/>
+          </w:tcPr>
+          <w:p>
+            <w:pPr>
+              <w:spacing w:after="20" w:before="20"/>
+            </w:pPr>
+            <w:r>
+              <w:rPr>
+                <w:sz w:val="14"/>
+              </w:rPr>
+              <w:t>Conditional</w:t>
+            </w:r>
+          </w:p>
+        </w:tc>
+      </w:tr>
+      <w:tr>
+        <w:tc>
+          <w:tcPr>
+            <w:tcW w:type="dxa" w:w="792"/>
+            <w:vAlign w:val="center"/>
+          </w:tcPr>
+          <w:p>
+            <w:pPr>
+              <w:spacing w:after="20" w:before="20"/>
+            </w:pPr>
+            <w:r>
+              <w:rPr>
+                <w:sz w:val="14"/>
+              </w:rPr>
+              <w:t>Q7</w:t>
+            </w:r>
+          </w:p>
+        </w:tc>
+        <w:tc>
+          <w:tcPr>
+            <w:tcW w:type="dxa" w:w="3384"/>
+            <w:vAlign w:val="center"/>
+          </w:tcPr>
+          <w:p>
+            <w:pPr>
+              <w:spacing w:after="20" w:before="20"/>
+            </w:pPr>
+            <w:r>
+              <w:rPr>
+                <w:sz w:val="14"/>
+              </w:rPr>
+              <w:t>Prescription scan maximum is 16 MB.</w:t>
+            </w:r>
+          </w:p>
+        </w:tc>
+        <w:tc>
+          <w:tcPr>
+            <w:tcW w:type="dxa" w:w="4392"/>
+            <w:vAlign w:val="center"/>
+          </w:tcPr>
+          <w:p>
+            <w:pPr>
+              <w:spacing w:after="20" w:before="20"/>
+            </w:pPr>
+            <w:r>
+              <w:rPr>
+                <w:sz w:val="14"/>
+              </w:rPr>
+              <w:t>Enforce 16,000,000 bytes server-side; accept PDF, JPEG and PNG only.</w:t>
+            </w:r>
+          </w:p>
+        </w:tc>
+        <w:tc>
+          <w:tcPr>
+            <w:tcW w:type="dxa" w:w="1224"/>
+            <w:vAlign w:val="center"/>
+          </w:tcPr>
+          <w:p>
+            <w:pPr>
+              <w:spacing w:after="20" w:before="20"/>
+            </w:pPr>
+            <w:r>
+              <w:rPr>
+                <w:sz w:val="14"/>
+              </w:rPr>
+              <w:t>Implemented</w:t>
+            </w:r>
+          </w:p>
+        </w:tc>
+      </w:tr>
+      <w:tr>
+        <w:tc>
+          <w:tcPr>
+            <w:tcW w:type="dxa" w:w="792"/>
+            <w:vAlign w:val="center"/>
+          </w:tcPr>
+          <w:p>
+            <w:pPr>
+              <w:spacing w:after="20" w:before="20"/>
+            </w:pPr>
+            <w:r>
+              <w:rPr>
+                <w:sz w:val="14"/>
+              </w:rPr>
+              <w:t>Q8</w:t>
+            </w:r>
+          </w:p>
+        </w:tc>
+        <w:tc>
+          <w:tcPr>
+            <w:tcW w:type="dxa" w:w="3384"/>
+            <w:vAlign w:val="center"/>
+          </w:tcPr>
+          <w:p>
+            <w:pPr>
+              <w:spacing w:after="20" w:before="20"/>
+            </w:pPr>
+            <w:r>
+              <w:rPr>
+                <w:sz w:val="14"/>
+              </w:rPr>
+              <w:t>Customer service will contact the pharmacy on prescription review exceptions; no formal API process exists.</w:t>
+            </w:r>
+          </w:p>
+        </w:tc>
+        <w:tc>
+          <w:tcPr>
+            <w:tcW w:type="dxa" w:w="4392"/>
+            <w:vAlign w:val="center"/>
+          </w:tcPr>
+          <w:p>
+            <w:pPr>
+              <w:spacing w:after="20" w:before="20"/>
+            </w:pPr>
+            <w:r>
+              <w:rPr>
+                <w:sz w:val="14"/>
+              </w:rPr>
+              <w:t>Create an audited support case without assuming CANCELLED means declined.</w:t>
+            </w:r>
+          </w:p>
+        </w:tc>
+        <w:tc>
+          <w:tcPr>
+            <w:tcW w:type="dxa" w:w="1224"/>
+            <w:vAlign w:val="center"/>
+          </w:tcPr>
+          <w:p>
+            <w:pPr>
+              <w:spacing w:after="20" w:before="20"/>
+            </w:pPr>
+            <w:r>
+              <w:rPr>
+                <w:sz w:val="14"/>
+              </w:rPr>
+              <w:t>Implemented</w:t>
+            </w:r>
+          </w:p>
+        </w:tc>
+      </w:tr>
+      <w:tr>
+        <w:tc>
+          <w:tcPr>
+            <w:tcW w:type="dxa" w:w="792"/>
+            <w:vAlign w:val="center"/>
+          </w:tcPr>
+          <w:p>
+            <w:pPr>
+              <w:spacing w:after="20" w:before="20"/>
+            </w:pPr>
+            <w:r>
+              <w:rPr>
+                <w:sz w:val="14"/>
+              </w:rPr>
+              <w:t>Q9</w:t>
+            </w:r>
+          </w:p>
+        </w:tc>
+        <w:tc>
+          <w:tcPr>
+            <w:tcW w:type="dxa" w:w="3384"/>
+            <w:vAlign w:val="center"/>
+          </w:tcPr>
+          <w:p>
+            <w:pPr>
+              <w:spacing w:after="20" w:before="20"/>
+            </w:pPr>
+            <w:r>
+              <w:rPr>
+                <w:sz w:val="14"/>
+              </w:rPr>
+              <w:t>Soft limit is 1 request/second; use 429 headers; recommended polling is every 10 seconds.</w:t>
+            </w:r>
+          </w:p>
+        </w:tc>
+        <w:tc>
+          <w:tcPr>
+            <w:tcW w:type="dxa" w:w="4392"/>
+            <w:vAlign w:val="center"/>
+          </w:tcPr>
+          <w:p>
+            <w:pPr>
+              <w:spacing w:after="20" w:before="20"/>
+            </w:pPr>
+            <w:r>
+              <w:rPr>
+                <w:sz w:val="14"/>
+              </w:rPr>
+              <w:t>Use per-pharmacy throttling, event cursors, retry-after handling and a task watchdog.</w:t>
+            </w:r>
+          </w:p>
+        </w:tc>
+        <w:tc>
+          <w:tcPr>
+            <w:tcW w:type="dxa" w:w="1224"/>
+            <w:vAlign w:val="center"/>
+          </w:tcPr>
+          <w:p>
+            <w:pPr>
+              <w:spacing w:after="20" w:before="20"/>
+            </w:pPr>
+            <w:r>
+              <w:rPr>
+                <w:sz w:val="14"/>
+              </w:rPr>
+              <w:t>Implemented</w:t>
+            </w:r>
+          </w:p>
+        </w:tc>
+      </w:tr>
+      <w:tr>
+        <w:tc>
+          <w:tcPr>
+            <w:tcW w:type="dxa" w:w="792"/>
+            <w:vAlign w:val="center"/>
+          </w:tcPr>
+          <w:p>
+            <w:pPr>
+              <w:spacing w:after="20" w:before="20"/>
+            </w:pPr>
+            <w:r>
+              <w:rPr>
+                <w:sz w:val="14"/>
+              </w:rPr>
+              <w:t>Q10</w:t>
+            </w:r>
+          </w:p>
+        </w:tc>
+        <w:tc>
+          <w:tcPr>
+            <w:tcW w:type="dxa" w:w="3384"/>
+            <w:vAlign w:val="center"/>
+          </w:tcPr>
+          <w:p>
+            <w:pPr>
+              <w:spacing w:after="20" w:before="20"/>
+            </w:pPr>
+            <w:r>
+              <w:rPr>
+                <w:sz w:val="14"/>
+              </w:rPr>
+              <w:t>A prescriber is required for every prescription and Curaleaf validates credentials before shipping.</w:t>
+            </w:r>
+          </w:p>
+        </w:tc>
+        <w:tc>
+          <w:tcPr>
+            <w:tcW w:type="dxa" w:w="4392"/>
+            <w:vAlign w:val="center"/>
+          </w:tcPr>
+          <w:p>
+            <w:pPr>
+              <w:spacing w:after="20" w:before="20"/>
+            </w:pPr>
+            <w:r>
+              <w:rPr>
+                <w:sz w:val="14"/>
+              </w:rPr>
+              <w:t>Search/create the prescriber first and show PENDING as supplier credential validation/review.</w:t>
+            </w:r>
+          </w:p>
+        </w:tc>
+        <w:tc>
+          <w:tcPr>
+            <w:tcW w:type="dxa" w:w="1224"/>
+            <w:vAlign w:val="center"/>
+          </w:tcPr>
+          <w:p>
+            <w:pPr>
+              <w:spacing w:after="20" w:before="20"/>
+            </w:pPr>
+            <w:r>
+              <w:rPr>
+                <w:sz w:val="14"/>
+              </w:rPr>
+              <w:t>Implemented</w:t>
+            </w:r>
+          </w:p>
+        </w:tc>
+      </w:tr>
+      <w:tr>
+        <w:tc>
+          <w:tcPr>
+            <w:tcW w:type="dxa" w:w="792"/>
+            <w:vAlign w:val="center"/>
+          </w:tcPr>
+          <w:p>
+            <w:pPr>
+              <w:spacing w:after="20" w:before="20"/>
+            </w:pPr>
+            <w:r>
+              <w:rPr>
+                <w:sz w:val="14"/>
+              </w:rPr>
+              <w:t>Q11</w:t>
+            </w:r>
+          </w:p>
+        </w:tc>
+        <w:tc>
+          <w:tcPr>
+            <w:tcW w:type="dxa" w:w="3384"/>
+            <w:vAlign w:val="center"/>
+          </w:tcPr>
+          <w:p>
+            <w:pPr>
+              <w:spacing w:after="20" w:before="20"/>
+            </w:pPr>
+            <w:r>
+              <w:rPr>
+                <w:sz w:val="14"/>
+              </w:rPr>
+              <w:t>Purchase-order cancellation requires customer service; no API endpoint exists.</w:t>
+            </w:r>
+          </w:p>
+        </w:tc>
+        <w:tc>
+          <w:tcPr>
+            <w:tcW w:type="dxa" w:w="4392"/>
+            <w:vAlign w:val="center"/>
+          </w:tcPr>
+          <w:p>
+            <w:pPr>
+              <w:spacing w:after="20" w:before="20"/>
+            </w:pPr>
+            <w:r>
+              <w:rPr>
+                <w:sz w:val="14"/>
+              </w:rPr>
+              <w:t>Record an audited request only while PO is CREATED; wait for Curaleaf confirmation.</w:t>
+            </w:r>
+          </w:p>
+        </w:tc>
+        <w:tc>
+          <w:tcPr>
+            <w:tcW w:type="dxa" w:w="1224"/>
+            <w:vAlign w:val="center"/>
+          </w:tcPr>
+          <w:p>
+            <w:pPr>
+              <w:spacing w:after="20" w:before="20"/>
+            </w:pPr>
+            <w:r>
+              <w:rPr>
+                <w:sz w:val="14"/>
+              </w:rPr>
+              <w:t>Implemented</w:t>
+            </w:r>
+          </w:p>
+        </w:tc>
+      </w:tr>
+      <w:tr>
+        <w:tc>
+          <w:tcPr>
+            <w:tcW w:type="dxa" w:w="792"/>
+            <w:vAlign w:val="center"/>
+          </w:tcPr>
+          <w:p>
+            <w:pPr>
+              <w:spacing w:after="20" w:before="20"/>
+            </w:pPr>
+            <w:r>
+              <w:rPr>
+                <w:sz w:val="14"/>
+              </w:rPr>
+              <w:t>Q12</w:t>
+            </w:r>
+          </w:p>
+        </w:tc>
+        <w:tc>
+          <w:tcPr>
+            <w:tcW w:type="dxa" w:w="3384"/>
+            <w:vAlign w:val="center"/>
+          </w:tcPr>
+          <w:p>
+            <w:pPr>
+              <w:spacing w:after="20" w:before="20"/>
+            </w:pPr>
+            <w:r>
+              <w:rPr>
+                <w:sz w:val="14"/>
+              </w:rPr>
+              <w:t>Catalogue price is recommended patient price; /quotes is authoritative for order cost and discounts.</w:t>
+            </w:r>
+          </w:p>
+        </w:tc>
+        <w:tc>
+          <w:tcPr>
+            <w:tcW w:type="dxa" w:w="4392"/>
+            <w:vAlign w:val="center"/>
+          </w:tcPr>
+          <w:p>
+            <w:pPr>
+              <w:spacing w:after="20" w:before="20"/>
+            </w:pPr>
+            <w:r>
+              <w:rPr>
+                <w:sz w:val="14"/>
+              </w:rPr>
+              <w:t>Requote immediately before PO placement and hold stock/price changes for the agreed workflow.</w:t>
+            </w:r>
+          </w:p>
+        </w:tc>
+        <w:tc>
+          <w:tcPr>
+            <w:tcW w:type="dxa" w:w="1224"/>
+            <w:vAlign w:val="center"/>
+          </w:tcPr>
+          <w:p>
+            <w:pPr>
+              <w:spacing w:after="20" w:before="20"/>
+            </w:pPr>
+            <w:r>
+              <w:rPr>
+                <w:sz w:val="14"/>
+              </w:rPr>
+              <w:t>Implemented</w:t>
+            </w:r>
+          </w:p>
+        </w:tc>
+      </w:tr>
+      <w:tr>
+        <w:tc>
+          <w:tcPr>
+            <w:tcW w:type="dxa" w:w="792"/>
+            <w:vAlign w:val="center"/>
+          </w:tcPr>
+          <w:p>
+            <w:pPr>
+              <w:spacing w:after="20" w:before="20"/>
+            </w:pPr>
+            <w:r>
+              <w:rPr>
+                <w:sz w:val="14"/>
+              </w:rPr>
+              <w:t>Q13</w:t>
+            </w:r>
+          </w:p>
+        </w:tc>
+        <w:tc>
+          <w:tcPr>
+            <w:tcW w:type="dxa" w:w="3384"/>
+            <w:vAlign w:val="center"/>
+          </w:tcPr>
+          <w:p>
+            <w:pPr>
+              <w:spacing w:after="20" w:before="20"/>
+            </w:pPr>
+            <w:r>
+              <w:rPr>
+                <w:sz w:val="14"/>
+              </w:rPr>
+              <w:t>DPA, data-sharing and prescription-scan retention terms remain with legal/commercial.</w:t>
+            </w:r>
+          </w:p>
+        </w:tc>
+        <w:tc>
+          <w:tcPr>
+            <w:tcW w:type="dxa" w:w="4392"/>
+            <w:vAlign w:val="center"/>
+          </w:tcPr>
+          <w:p>
+            <w:pPr>
+              <w:spacing w:after="20" w:before="20"/>
+            </w:pPr>
+            <w:r>
+              <w:rPr>
+                <w:sz w:val="14"/>
+              </w:rPr>
+              <w:t>Block production patient/prescription-data go-live until received and approved.</w:t>
+            </w:r>
+          </w:p>
+        </w:tc>
+        <w:tc>
+          <w:tcPr>
+            <w:tcW w:type="dxa" w:w="1224"/>
+            <w:vAlign w:val="center"/>
+          </w:tcPr>
+          <w:p>
+            <w:pPr>
+              <w:spacing w:after="20" w:before="20"/>
+            </w:pPr>
+            <w:r>
+              <w:rPr>
+                <w:sz w:val="14"/>
+              </w:rPr>
+              <w:t>Legal gate</w:t>
+            </w:r>
+          </w:p>
+        </w:tc>
+      </w:tr>
+    </w:tbl>
+    <w:p>
+      <w:pPr>
+        <w:spacing w:before="200" w:after="80"/>
+      </w:pPr>
+      <w:r>
+        <w:rPr>
+          <w:b/>
+          <w:sz w:val="18"/>
+        </w:rPr>
+        <w:t>Operational release gates</w:t>
+      </w:r>
+    </w:p>
+    <w:p>
+      <w:r>
+        <w:rPr>
+          <w:b/>
+          <w:sz w:val="18"/>
+        </w:rPr>
+        <w:t xml:space="preserve">Release gate. </w:t>
+      </w:r>
+      <w:r>
+        <w:rPr>
+          <w:sz w:val="18"/>
+        </w:rPr>
+        <w:t>Do not enable production patient or prescription data until Q13 legal terms and retention rules are approved.</w:t>
+      </w:r>
+    </w:p>
+    <w:p>
+      <w:r>
+        <w:rPr>
+          <w:b/>
+          <w:sz w:val="18"/>
+        </w:rPr>
+        <w:t xml:space="preserve">Release gate. </w:t>
+      </w:r>
+      <w:r>
+        <w:rPr>
+          <w:sz w:val="18"/>
+        </w:rPr>
+        <w:t>Do not declare multi-pharmacy sandbox UAT complete until Q4 and Q5 provide stocked products and two tenant keys.</w:t>
+      </w:r>
+    </w:p>
+    <w:p>
+      <w:r>
+        <w:rPr>
+          <w:b/>
+          <w:sz w:val="18"/>
+        </w:rPr>
+        <w:t xml:space="preserve">Release gate. </w:t>
+      </w:r>
+      <w:r>
+        <w:rPr>
+          <w:sz w:val="18"/>
+        </w:rPr>
+        <w:t>Do not enable direct-to-live onboarding until Ellis and Curaleaf confirm the post-acceptance route in writing.</w:t>
       </w:r>
     </w:p>
     <w:sectPr>

</xml_diff>